<commit_message>
update code for check chamcong after time specifice
</commit_message>
<xml_diff>
--- a/public/template/CN_HD_TM.docx
+++ b/public/template/CN_HD_TM.docx
@@ -393,47 +393,7 @@
           <w:sz w:val="22"/>
           <w:szCs w:val="22"/>
         </w:rPr>
-        <w:t>Khóm Trung Thạnh</w:t>
-      </w:r>
-      <w:r>
-        <w:rPr>
-          <w:rFonts w:ascii="TCM Pro" w:hAnsi="TCM Pro" w:cs="Arial"/>
-          <w:sz w:val="22"/>
-          <w:szCs w:val="22"/>
-        </w:rPr>
-        <w:t>, P</w:t>
-      </w:r>
-      <w:r>
-        <w:rPr>
-          <w:rFonts w:ascii="TCM Pro" w:hAnsi="TCM Pro" w:cs="Arial"/>
-          <w:sz w:val="22"/>
-          <w:szCs w:val="22"/>
-        </w:rPr>
-        <w:t>hường Mỹ Thới</w:t>
-      </w:r>
-      <w:r>
-        <w:rPr>
-          <w:rFonts w:ascii="TCM Pro" w:hAnsi="TCM Pro" w:cs="Arial"/>
-          <w:sz w:val="22"/>
-          <w:szCs w:val="22"/>
-        </w:rPr>
-        <w:t>,</w:t>
-      </w:r>
-      <w:r>
-        <w:rPr>
-          <w:rFonts w:ascii="TCM Pro" w:hAnsi="TCM Pro" w:cs="Arial"/>
-          <w:sz w:val="22"/>
-          <w:szCs w:val="22"/>
-        </w:rPr>
-        <w:t xml:space="preserve"> Tỉnh </w:t>
-      </w:r>
-      <w:r>
-        <w:rPr>
-          <w:rFonts w:ascii="TCM Pro" w:hAnsi="TCM Pro" w:cs="Arial"/>
-          <w:sz w:val="22"/>
-          <w:szCs w:val="22"/>
-        </w:rPr>
-        <w:t>An Giang</w:t>
+        <w:t>19/6C, Trần Hưng Đạo, Phường Long Xuyên, Tỉnh An Giang</w:t>
       </w:r>
     </w:p>
     <w:p>

</xml_diff>